<commit_message>
RAID Decisions sheet + template, Export PDF replaces Print, PowerPoint export on the client template
- RAID: Decisions sheet (parser, summary, UI table, KPI highlights/actions), new templates/ATS_RAID_Log_Template.xlsx, sample log gains decisions
- Replace Print with Export PDF (bundled jsPDF + html2canvas): full pack for Monthly/Weekly, current view for Programme/POAP
- PowerPoint export now sits on the client PowerPoint theme (lean embedded template: masters, layouts, logos only; no slide content), native editable charts and tables, real title placeholders and table style
- tools/build_pptx_template.py rebuilds the embedded theme from a corporate deck; docs and README updated

Co-Authored-By: Claude Sonnet 5.5 <noreply@anthropic.com>
</commit_message>
<xml_diff>
--- a/docs/ATS_Data_Filling_Guide.docx
+++ b/docs/ATS_Data_Filling_Guide.docx
@@ -862,7 +862,7 @@
                 <w:sz w:val="16"/>
                 <w:szCs w:val="16"/>
               </w:rPr>
-              <w:t xml:space="preserve">samples/ATS_Program_SAMPLE/</w:t>
+              <w:t xml:space="preserve">templates/ATS_RAID_Log_Template.xlsx</w:t>
             </w:r>
           </w:p>
         </w:tc>
@@ -893,7 +893,25 @@
                 <w:sz w:val="18"/>
                 <w:szCs w:val="18"/>
               </w:rPr>
-              <w:t xml:space="preserve">Five fictional portfolios (Self Assessment, PAYE, VAT, Customs Declaration Service, Child Benefit). Self Assessment also has a POAP and a RAID log.</w:t>
+              <w:t xml:space="preserve">Blank RAID log with </w:t>
+            </w:r>
+            <w:r>
+              <w:rPr>
+                <w:rFonts w:ascii="Arial" w:cs="Arial" w:eastAsia="Arial" w:hAnsi="Arial"/>
+                <w:b/>
+                <w:bCs/>
+                <w:sz w:val="18"/>
+                <w:szCs w:val="18"/>
+              </w:rPr>
+              <w:t xml:space="preserve">Risks, Issues, Assumptions, Dependencies and Decisions</w:t>
+            </w:r>
+            <w:r>
+              <w:rPr>
+                <w:rFonts w:ascii="Arial" w:cs="Arial" w:eastAsia="Arial" w:hAnsi="Arial"/>
+                <w:sz w:val="18"/>
+                <w:szCs w:val="18"/>
+              </w:rPr>
+              <w:t xml:space="preserve"> sheets, dropdowns and a user guide.</w:t>
             </w:r>
           </w:p>
         </w:tc>
@@ -924,7 +942,7 @@
                 <w:sz w:val="18"/>
                 <w:szCs w:val="18"/>
               </w:rPr>
-              <w:t xml:space="preserve">Everyone — to see how a filled workbook looks</w:t>
+              <w:t xml:space="preserve">Portfolios that keep a RAID log</w:t>
             </w:r>
           </w:p>
         </w:tc>
@@ -961,7 +979,7 @@
                 <w:sz w:val="16"/>
                 <w:szCs w:val="16"/>
               </w:rPr>
-              <w:t xml:space="preserve">ATS_Program/</w:t>
+              <w:t xml:space="preserve">samples/ATS_Program_SAMPLE/</w:t>
             </w:r>
           </w:p>
         </w:tc>
@@ -992,7 +1010,7 @@
                 <w:sz w:val="18"/>
                 <w:szCs w:val="18"/>
               </w:rPr>
-              <w:t xml:space="preserve">Your real data folder. Put one subfolder per portfolio here.</w:t>
+              <w:t xml:space="preserve">Five fictional portfolios (Self Assessment, PAYE, VAT, Customs Declaration Service, Child Benefit). Self Assessment also has a POAP and a RAID log.</w:t>
             </w:r>
           </w:p>
         </w:tc>
@@ -1023,7 +1041,7 @@
                 <w:sz w:val="18"/>
                 <w:szCs w:val="18"/>
               </w:rPr>
-              <w:t xml:space="preserve">Programme lead</w:t>
+              <w:t xml:space="preserve">Everyone — to see how a filled workbook looks</w:t>
             </w:r>
           </w:p>
         </w:tc>
@@ -1060,6 +1078,105 @@
                 <w:sz w:val="16"/>
                 <w:szCs w:val="16"/>
               </w:rPr>
+              <w:t xml:space="preserve">ATS_Program/</w:t>
+            </w:r>
+          </w:p>
+        </w:tc>
+        <w:tc>
+          <w:tcPr>
+            <w:tcW w:type="dxa" w:w="4438"/>
+            <w:tcBorders>
+              <w:top w:val="single" w:color="D0D5DD" w:sz="4"/>
+              <w:left w:val="single" w:color="D0D5DD" w:sz="4"/>
+              <w:bottom w:val="single" w:color="D0D5DD" w:sz="4"/>
+              <w:right w:val="single" w:color="D0D5DD" w:sz="4"/>
+            </w:tcBorders>
+            <w:shd w:fill="FFFFFF" w:val="clear"/>
+            <w:tcMar>
+              <w:top w:type="dxa" w:w="70"/>
+              <w:left w:type="dxa" w:w="100"/>
+              <w:bottom w:type="dxa" w:w="70"/>
+              <w:right w:type="dxa" w:w="100"/>
+            </w:tcMar>
+          </w:tcPr>
+          <w:p>
+            <w:pPr>
+              <w:spacing w:line="260"/>
+            </w:pPr>
+            <w:r>
+              <w:rPr>
+                <w:rFonts w:ascii="Arial" w:cs="Arial" w:eastAsia="Arial" w:hAnsi="Arial"/>
+                <w:sz w:val="18"/>
+                <w:szCs w:val="18"/>
+              </w:rPr>
+              <w:t xml:space="preserve">Your real data folder. Put one subfolder per portfolio here.</w:t>
+            </w:r>
+          </w:p>
+        </w:tc>
+        <w:tc>
+          <w:tcPr>
+            <w:tcW w:type="dxa" w:w="2000"/>
+            <w:tcBorders>
+              <w:top w:val="single" w:color="D0D5DD" w:sz="4"/>
+              <w:left w:val="single" w:color="D0D5DD" w:sz="4"/>
+              <w:bottom w:val="single" w:color="D0D5DD" w:sz="4"/>
+              <w:right w:val="single" w:color="D0D5DD" w:sz="4"/>
+            </w:tcBorders>
+            <w:shd w:fill="FFFFFF" w:val="clear"/>
+            <w:tcMar>
+              <w:top w:type="dxa" w:w="70"/>
+              <w:left w:type="dxa" w:w="100"/>
+              <w:bottom w:type="dxa" w:w="70"/>
+              <w:right w:type="dxa" w:w="100"/>
+            </w:tcMar>
+          </w:tcPr>
+          <w:p>
+            <w:pPr>
+              <w:spacing w:line="260"/>
+            </w:pPr>
+            <w:r>
+              <w:rPr>
+                <w:rFonts w:ascii="Arial" w:cs="Arial" w:eastAsia="Arial" w:hAnsi="Arial"/>
+                <w:sz w:val="18"/>
+                <w:szCs w:val="18"/>
+              </w:rPr>
+              <w:t xml:space="preserve">Programme lead</w:t>
+            </w:r>
+          </w:p>
+        </w:tc>
+      </w:tr>
+      <w:tr>
+        <w:trPr>
+          <w:cantSplit/>
+        </w:trPr>
+        <w:tc>
+          <w:tcPr>
+            <w:tcW w:type="dxa" w:w="3200"/>
+            <w:tcBorders>
+              <w:top w:val="single" w:color="D0D5DD" w:sz="4"/>
+              <w:left w:val="single" w:color="D0D5DD" w:sz="4"/>
+              <w:bottom w:val="single" w:color="D0D5DD" w:sz="4"/>
+              <w:right w:val="single" w:color="D0D5DD" w:sz="4"/>
+            </w:tcBorders>
+            <w:shd w:fill="F8FAFC" w:val="clear"/>
+            <w:tcMar>
+              <w:top w:type="dxa" w:w="70"/>
+              <w:left w:type="dxa" w:w="100"/>
+              <w:bottom w:type="dxa" w:w="70"/>
+              <w:right w:type="dxa" w:w="100"/>
+            </w:tcMar>
+          </w:tcPr>
+          <w:p>
+            <w:pPr>
+              <w:spacing w:line="260"/>
+            </w:pPr>
+            <w:r>
+              <w:rPr>
+                <w:rFonts w:ascii="Consolas" w:cs="Consolas" w:eastAsia="Consolas" w:hAnsi="Consolas"/>
+                <w:color w:val="9A3412"/>
+                <w:sz w:val="16"/>
+                <w:szCs w:val="16"/>
+              </w:rPr>
               <w:t xml:space="preserve">index.html</w:t>
             </w:r>
           </w:p>
@@ -1073,7 +1190,7 @@
               <w:bottom w:val="single" w:color="D0D5DD" w:sz="4"/>
               <w:right w:val="single" w:color="D0D5DD" w:sz="4"/>
             </w:tcBorders>
-            <w:shd w:fill="FFFFFF" w:val="clear"/>
+            <w:shd w:fill="F8FAFC" w:val="clear"/>
             <w:tcMar>
               <w:top w:type="dxa" w:w="70"/>
               <w:left w:type="dxa" w:w="100"/>
@@ -1104,7 +1221,7 @@
               <w:bottom w:val="single" w:color="D0D5DD" w:sz="4"/>
               <w:right w:val="single" w:color="D0D5DD" w:sz="4"/>
             </w:tcBorders>
-            <w:shd w:fill="FFFFFF" w:val="clear"/>
+            <w:shd w:fill="F8FAFC" w:val="clear"/>
             <w:tcMar>
               <w:top w:type="dxa" w:w="70"/>
               <w:left w:type="dxa" w:w="100"/>
@@ -1583,7 +1700,41 @@
           <w:sz w:val="21"/>
           <w:szCs w:val="21"/>
         </w:rPr>
-        <w:t xml:space="preserve"> and your RAID log into the same folder.</w:t>
+        <w:t xml:space="preserve"> and </w:t>
+      </w:r>
+      <w:r>
+        <w:rPr>
+          <w:rFonts w:ascii="Consolas" w:cs="Consolas" w:eastAsia="Consolas" w:hAnsi="Consolas"/>
+          <w:color w:val="9A3412"/>
+          <w:sz w:val="19"/>
+          <w:szCs w:val="19"/>
+        </w:rPr>
+        <w:t xml:space="preserve">templates/ATS_RAID_Log_Template.xlsx</w:t>
+      </w:r>
+      <w:r>
+        <w:rPr>
+          <w:rFonts w:ascii="Arial" w:cs="Arial" w:eastAsia="Arial" w:hAnsi="Arial"/>
+          <w:sz w:val="21"/>
+          <w:szCs w:val="21"/>
+        </w:rPr>
+        <w:t xml:space="preserve"> as </w:t>
+      </w:r>
+      <w:r>
+        <w:rPr>
+          <w:rFonts w:ascii="Consolas" w:cs="Consolas" w:eastAsia="Consolas" w:hAnsi="Consolas"/>
+          <w:color w:val="9A3412"/>
+          <w:sz w:val="19"/>
+          <w:szCs w:val="19"/>
+        </w:rPr>
+        <w:t xml:space="preserve">ATS_RAID_Log.xlsx</w:t>
+      </w:r>
+      <w:r>
+        <w:rPr>
+          <w:rFonts w:ascii="Arial" w:cs="Arial" w:eastAsia="Arial" w:hAnsi="Arial"/>
+          <w:sz w:val="21"/>
+          <w:szCs w:val="21"/>
+        </w:rPr>
+        <w:t xml:space="preserve"> into the same folder (or drop in your existing RAID file).</w:t>
       </w:r>
     </w:p>
     <w:p>
@@ -10652,7 +10803,712 @@
           <w:sz w:val="21"/>
           <w:szCs w:val="21"/>
         </w:rPr>
-        <w:t xml:space="preserve">Keep using your existing RAID log exactly as it is — no changes. Put it in the portfolio's folder. The dashboard reads the </w:t>
+        <w:t xml:space="preserve">Start a new log from </w:t>
+      </w:r>
+      <w:r>
+        <w:rPr>
+          <w:rFonts w:ascii="Consolas" w:cs="Consolas" w:eastAsia="Consolas" w:hAnsi="Consolas"/>
+          <w:color w:val="9A3412"/>
+          <w:sz w:val="19"/>
+          <w:szCs w:val="19"/>
+        </w:rPr>
+        <w:t xml:space="preserve">templates/ATS_RAID_Log_Template.xlsx</w:t>
+      </w:r>
+      <w:r>
+        <w:rPr>
+          <w:rFonts w:ascii="Arial" w:cs="Arial" w:eastAsia="Arial" w:hAnsi="Arial"/>
+          <w:sz w:val="21"/>
+          <w:szCs w:val="21"/>
+        </w:rPr>
+        <w:t xml:space="preserve"> (or keep using your existing RAID file — the dashboard finds columns by their header names). Put it in the portfolio's folder as </w:t>
+      </w:r>
+      <w:r>
+        <w:rPr>
+          <w:rFonts w:ascii="Consolas" w:cs="Consolas" w:eastAsia="Consolas" w:hAnsi="Consolas"/>
+          <w:color w:val="9A3412"/>
+          <w:sz w:val="19"/>
+          <w:szCs w:val="19"/>
+        </w:rPr>
+        <w:t xml:space="preserve">ATS_RAID_Log.xlsx</w:t>
+      </w:r>
+      <w:r>
+        <w:rPr>
+          <w:rFonts w:ascii="Arial" w:cs="Arial" w:eastAsia="Arial" w:hAnsi="Arial"/>
+          <w:sz w:val="21"/>
+          <w:szCs w:val="21"/>
+        </w:rPr>
+        <w:t xml:space="preserve">. It has five log sheets, each with the header on row 10 and data from row 11.</w:t>
+      </w:r>
+    </w:p>
+    <w:tbl>
+      <w:tblPr>
+        <w:tblW w:type="dxa" w:w="9638"/>
+        <w:tblBorders>
+          <w:top w:val="single" w:color="auto" w:sz="4"/>
+          <w:left w:val="single" w:color="auto" w:sz="4"/>
+          <w:bottom w:val="single" w:color="auto" w:sz="4"/>
+          <w:right w:val="single" w:color="auto" w:sz="4"/>
+          <w:insideH w:val="single" w:color="auto" w:sz="4"/>
+          <w:insideV w:val="single" w:color="auto" w:sz="4"/>
+        </w:tblBorders>
+      </w:tblPr>
+      <w:tblGrid>
+        <w:gridCol w:w="1800"/>
+        <w:gridCol w:w="1400"/>
+        <w:gridCol w:w="6438"/>
+      </w:tblGrid>
+      <w:tr>
+        <w:trPr>
+          <w:tblHeader/>
+        </w:trPr>
+        <w:tc>
+          <w:tcPr>
+            <w:tcW w:type="dxa" w:w="1800"/>
+            <w:tcBorders>
+              <w:top w:val="single" w:color="D0D5DD" w:sz="4"/>
+              <w:left w:val="single" w:color="D0D5DD" w:sz="4"/>
+              <w:bottom w:val="single" w:color="D0D5DD" w:sz="4"/>
+              <w:right w:val="single" w:color="D0D5DD" w:sz="4"/>
+            </w:tcBorders>
+            <w:shd w:fill="1B2A4A" w:val="clear"/>
+            <w:tcMar>
+              <w:top w:type="dxa" w:w="70"/>
+              <w:left w:type="dxa" w:w="100"/>
+              <w:bottom w:type="dxa" w:w="70"/>
+              <w:right w:type="dxa" w:w="100"/>
+            </w:tcMar>
+          </w:tcPr>
+          <w:p>
+            <w:pPr>
+              <w:spacing w:line="260"/>
+            </w:pPr>
+            <w:r>
+              <w:rPr>
+                <w:rFonts w:ascii="Arial" w:cs="Arial" w:eastAsia="Arial" w:hAnsi="Arial"/>
+                <w:b/>
+                <w:bCs/>
+                <w:color w:val="FFFFFF"/>
+                <w:sz w:val="18"/>
+                <w:szCs w:val="18"/>
+              </w:rPr>
+              <w:t xml:space="preserve">Sheet</w:t>
+            </w:r>
+          </w:p>
+        </w:tc>
+        <w:tc>
+          <w:tcPr>
+            <w:tcW w:type="dxa" w:w="1400"/>
+            <w:tcBorders>
+              <w:top w:val="single" w:color="D0D5DD" w:sz="4"/>
+              <w:left w:val="single" w:color="D0D5DD" w:sz="4"/>
+              <w:bottom w:val="single" w:color="D0D5DD" w:sz="4"/>
+              <w:right w:val="single" w:color="D0D5DD" w:sz="4"/>
+            </w:tcBorders>
+            <w:shd w:fill="1B2A4A" w:val="clear"/>
+            <w:tcMar>
+              <w:top w:type="dxa" w:w="70"/>
+              <w:left w:type="dxa" w:w="100"/>
+              <w:bottom w:type="dxa" w:w="70"/>
+              <w:right w:type="dxa" w:w="100"/>
+            </w:tcMar>
+          </w:tcPr>
+          <w:p>
+            <w:pPr>
+              <w:spacing w:line="260"/>
+            </w:pPr>
+            <w:r>
+              <w:rPr>
+                <w:rFonts w:ascii="Arial" w:cs="Arial" w:eastAsia="Arial" w:hAnsi="Arial"/>
+                <w:b/>
+                <w:bCs/>
+                <w:color w:val="FFFFFF"/>
+                <w:sz w:val="18"/>
+                <w:szCs w:val="18"/>
+              </w:rPr>
+              <w:t xml:space="preserve">One row per</w:t>
+            </w:r>
+          </w:p>
+        </w:tc>
+        <w:tc>
+          <w:tcPr>
+            <w:tcW w:type="dxa" w:w="6438"/>
+            <w:tcBorders>
+              <w:top w:val="single" w:color="D0D5DD" w:sz="4"/>
+              <w:left w:val="single" w:color="D0D5DD" w:sz="4"/>
+              <w:bottom w:val="single" w:color="D0D5DD" w:sz="4"/>
+              <w:right w:val="single" w:color="D0D5DD" w:sz="4"/>
+            </w:tcBorders>
+            <w:shd w:fill="1B2A4A" w:val="clear"/>
+            <w:tcMar>
+              <w:top w:type="dxa" w:w="70"/>
+              <w:left w:type="dxa" w:w="100"/>
+              <w:bottom w:type="dxa" w:w="70"/>
+              <w:right w:type="dxa" w:w="100"/>
+            </w:tcMar>
+          </w:tcPr>
+          <w:p>
+            <w:pPr>
+              <w:spacing w:line="260"/>
+            </w:pPr>
+            <w:r>
+              <w:rPr>
+                <w:rFonts w:ascii="Arial" w:cs="Arial" w:eastAsia="Arial" w:hAnsi="Arial"/>
+                <w:b/>
+                <w:bCs/>
+                <w:color w:val="FFFFFF"/>
+                <w:sz w:val="18"/>
+                <w:szCs w:val="18"/>
+              </w:rPr>
+              <w:t xml:space="preserve">Key columns</w:t>
+            </w:r>
+          </w:p>
+        </w:tc>
+      </w:tr>
+      <w:tr>
+        <w:trPr>
+          <w:cantSplit/>
+        </w:trPr>
+        <w:tc>
+          <w:tcPr>
+            <w:tcW w:type="dxa" w:w="1800"/>
+            <w:tcBorders>
+              <w:top w:val="single" w:color="D0D5DD" w:sz="4"/>
+              <w:left w:val="single" w:color="D0D5DD" w:sz="4"/>
+              <w:bottom w:val="single" w:color="D0D5DD" w:sz="4"/>
+              <w:right w:val="single" w:color="D0D5DD" w:sz="4"/>
+            </w:tcBorders>
+            <w:shd w:fill="FFFFFF" w:val="clear"/>
+            <w:tcMar>
+              <w:top w:type="dxa" w:w="70"/>
+              <w:left w:type="dxa" w:w="100"/>
+              <w:bottom w:type="dxa" w:w="70"/>
+              <w:right w:type="dxa" w:w="100"/>
+            </w:tcMar>
+          </w:tcPr>
+          <w:p>
+            <w:pPr>
+              <w:spacing w:line="260"/>
+            </w:pPr>
+            <w:r>
+              <w:rPr>
+                <w:rFonts w:ascii="Arial" w:cs="Arial" w:eastAsia="Arial" w:hAnsi="Arial"/>
+                <w:sz w:val="18"/>
+                <w:szCs w:val="18"/>
+              </w:rPr>
+              <w:t xml:space="preserve">Risks</w:t>
+            </w:r>
+          </w:p>
+        </w:tc>
+        <w:tc>
+          <w:tcPr>
+            <w:tcW w:type="dxa" w:w="1400"/>
+            <w:tcBorders>
+              <w:top w:val="single" w:color="D0D5DD" w:sz="4"/>
+              <w:left w:val="single" w:color="D0D5DD" w:sz="4"/>
+              <w:bottom w:val="single" w:color="D0D5DD" w:sz="4"/>
+              <w:right w:val="single" w:color="D0D5DD" w:sz="4"/>
+            </w:tcBorders>
+            <w:shd w:fill="FFFFFF" w:val="clear"/>
+            <w:tcMar>
+              <w:top w:type="dxa" w:w="70"/>
+              <w:left w:type="dxa" w:w="100"/>
+              <w:bottom w:type="dxa" w:w="70"/>
+              <w:right w:type="dxa" w:w="100"/>
+            </w:tcMar>
+          </w:tcPr>
+          <w:p>
+            <w:pPr>
+              <w:spacing w:line="260"/>
+            </w:pPr>
+            <w:r>
+              <w:rPr>
+                <w:rFonts w:ascii="Arial" w:cs="Arial" w:eastAsia="Arial" w:hAnsi="Arial"/>
+                <w:sz w:val="18"/>
+                <w:szCs w:val="18"/>
+              </w:rPr>
+              <w:t xml:space="preserve">risk</w:t>
+            </w:r>
+          </w:p>
+        </w:tc>
+        <w:tc>
+          <w:tcPr>
+            <w:tcW w:type="dxa" w:w="6438"/>
+            <w:tcBorders>
+              <w:top w:val="single" w:color="D0D5DD" w:sz="4"/>
+              <w:left w:val="single" w:color="D0D5DD" w:sz="4"/>
+              <w:bottom w:val="single" w:color="D0D5DD" w:sz="4"/>
+              <w:right w:val="single" w:color="D0D5DD" w:sz="4"/>
+            </w:tcBorders>
+            <w:shd w:fill="FFFFFF" w:val="clear"/>
+            <w:tcMar>
+              <w:top w:type="dxa" w:w="70"/>
+              <w:left w:type="dxa" w:w="100"/>
+              <w:bottom w:type="dxa" w:w="70"/>
+              <w:right w:type="dxa" w:w="100"/>
+            </w:tcMar>
+          </w:tcPr>
+          <w:p>
+            <w:pPr>
+              <w:spacing w:line="260"/>
+            </w:pPr>
+            <w:r>
+              <w:rPr>
+                <w:rFonts w:ascii="Arial" w:cs="Arial" w:eastAsia="Arial" w:hAnsi="Arial"/>
+                <w:sz w:val="18"/>
+                <w:szCs w:val="18"/>
+              </w:rPr>
+              <w:t xml:space="preserve">Summary Title, Likelihood, Impact (score = L × I → Very Low … Very High), Status (Open / Mitigated / Closed), Mitigation, Owner, Review Date</w:t>
+            </w:r>
+          </w:p>
+        </w:tc>
+      </w:tr>
+      <w:tr>
+        <w:trPr>
+          <w:cantSplit/>
+        </w:trPr>
+        <w:tc>
+          <w:tcPr>
+            <w:tcW w:type="dxa" w:w="1800"/>
+            <w:tcBorders>
+              <w:top w:val="single" w:color="D0D5DD" w:sz="4"/>
+              <w:left w:val="single" w:color="D0D5DD" w:sz="4"/>
+              <w:bottom w:val="single" w:color="D0D5DD" w:sz="4"/>
+              <w:right w:val="single" w:color="D0D5DD" w:sz="4"/>
+            </w:tcBorders>
+            <w:shd w:fill="F8FAFC" w:val="clear"/>
+            <w:tcMar>
+              <w:top w:type="dxa" w:w="70"/>
+              <w:left w:type="dxa" w:w="100"/>
+              <w:bottom w:type="dxa" w:w="70"/>
+              <w:right w:type="dxa" w:w="100"/>
+            </w:tcMar>
+          </w:tcPr>
+          <w:p>
+            <w:pPr>
+              <w:spacing w:line="260"/>
+            </w:pPr>
+            <w:r>
+              <w:rPr>
+                <w:rFonts w:ascii="Arial" w:cs="Arial" w:eastAsia="Arial" w:hAnsi="Arial"/>
+                <w:sz w:val="18"/>
+                <w:szCs w:val="18"/>
+              </w:rPr>
+              <w:t xml:space="preserve">Issues</w:t>
+            </w:r>
+          </w:p>
+        </w:tc>
+        <w:tc>
+          <w:tcPr>
+            <w:tcW w:type="dxa" w:w="1400"/>
+            <w:tcBorders>
+              <w:top w:val="single" w:color="D0D5DD" w:sz="4"/>
+              <w:left w:val="single" w:color="D0D5DD" w:sz="4"/>
+              <w:bottom w:val="single" w:color="D0D5DD" w:sz="4"/>
+              <w:right w:val="single" w:color="D0D5DD" w:sz="4"/>
+            </w:tcBorders>
+            <w:shd w:fill="F8FAFC" w:val="clear"/>
+            <w:tcMar>
+              <w:top w:type="dxa" w:w="70"/>
+              <w:left w:type="dxa" w:w="100"/>
+              <w:bottom w:type="dxa" w:w="70"/>
+              <w:right w:type="dxa" w:w="100"/>
+            </w:tcMar>
+          </w:tcPr>
+          <w:p>
+            <w:pPr>
+              <w:spacing w:line="260"/>
+            </w:pPr>
+            <w:r>
+              <w:rPr>
+                <w:rFonts w:ascii="Arial" w:cs="Arial" w:eastAsia="Arial" w:hAnsi="Arial"/>
+                <w:sz w:val="18"/>
+                <w:szCs w:val="18"/>
+              </w:rPr>
+              <w:t xml:space="preserve">issue</w:t>
+            </w:r>
+          </w:p>
+        </w:tc>
+        <w:tc>
+          <w:tcPr>
+            <w:tcW w:type="dxa" w:w="6438"/>
+            <w:tcBorders>
+              <w:top w:val="single" w:color="D0D5DD" w:sz="4"/>
+              <w:left w:val="single" w:color="D0D5DD" w:sz="4"/>
+              <w:bottom w:val="single" w:color="D0D5DD" w:sz="4"/>
+              <w:right w:val="single" w:color="D0D5DD" w:sz="4"/>
+            </w:tcBorders>
+            <w:shd w:fill="F8FAFC" w:val="clear"/>
+            <w:tcMar>
+              <w:top w:type="dxa" w:w="70"/>
+              <w:left w:type="dxa" w:w="100"/>
+              <w:bottom w:type="dxa" w:w="70"/>
+              <w:right w:type="dxa" w:w="100"/>
+            </w:tcMar>
+          </w:tcPr>
+          <w:p>
+            <w:pPr>
+              <w:spacing w:line="260"/>
+            </w:pPr>
+            <w:r>
+              <w:rPr>
+                <w:rFonts w:ascii="Arial" w:cs="Arial" w:eastAsia="Arial" w:hAnsi="Arial"/>
+                <w:sz w:val="18"/>
+                <w:szCs w:val="18"/>
+              </w:rPr>
+              <w:t xml:space="preserve">Summary Title, Priority, Severity, Status (Open / Resolution in progress / Resolved / Closed), Target and Actual Resolution Date</w:t>
+            </w:r>
+          </w:p>
+        </w:tc>
+      </w:tr>
+      <w:tr>
+        <w:trPr>
+          <w:cantSplit/>
+        </w:trPr>
+        <w:tc>
+          <w:tcPr>
+            <w:tcW w:type="dxa" w:w="1800"/>
+            <w:tcBorders>
+              <w:top w:val="single" w:color="D0D5DD" w:sz="4"/>
+              <w:left w:val="single" w:color="D0D5DD" w:sz="4"/>
+              <w:bottom w:val="single" w:color="D0D5DD" w:sz="4"/>
+              <w:right w:val="single" w:color="D0D5DD" w:sz="4"/>
+            </w:tcBorders>
+            <w:shd w:fill="FFFFFF" w:val="clear"/>
+            <w:tcMar>
+              <w:top w:type="dxa" w:w="70"/>
+              <w:left w:type="dxa" w:w="100"/>
+              <w:bottom w:type="dxa" w:w="70"/>
+              <w:right w:type="dxa" w:w="100"/>
+            </w:tcMar>
+          </w:tcPr>
+          <w:p>
+            <w:pPr>
+              <w:spacing w:line="260"/>
+            </w:pPr>
+            <w:r>
+              <w:rPr>
+                <w:rFonts w:ascii="Arial" w:cs="Arial" w:eastAsia="Arial" w:hAnsi="Arial"/>
+                <w:sz w:val="18"/>
+                <w:szCs w:val="18"/>
+              </w:rPr>
+              <w:t xml:space="preserve">Assumptions</w:t>
+            </w:r>
+          </w:p>
+        </w:tc>
+        <w:tc>
+          <w:tcPr>
+            <w:tcW w:type="dxa" w:w="1400"/>
+            <w:tcBorders>
+              <w:top w:val="single" w:color="D0D5DD" w:sz="4"/>
+              <w:left w:val="single" w:color="D0D5DD" w:sz="4"/>
+              <w:bottom w:val="single" w:color="D0D5DD" w:sz="4"/>
+              <w:right w:val="single" w:color="D0D5DD" w:sz="4"/>
+            </w:tcBorders>
+            <w:shd w:fill="FFFFFF" w:val="clear"/>
+            <w:tcMar>
+              <w:top w:type="dxa" w:w="70"/>
+              <w:left w:type="dxa" w:w="100"/>
+              <w:bottom w:type="dxa" w:w="70"/>
+              <w:right w:type="dxa" w:w="100"/>
+            </w:tcMar>
+          </w:tcPr>
+          <w:p>
+            <w:pPr>
+              <w:spacing w:line="260"/>
+            </w:pPr>
+            <w:r>
+              <w:rPr>
+                <w:rFonts w:ascii="Arial" w:cs="Arial" w:eastAsia="Arial" w:hAnsi="Arial"/>
+                <w:sz w:val="18"/>
+                <w:szCs w:val="18"/>
+              </w:rPr>
+              <w:t xml:space="preserve">assumption</w:t>
+            </w:r>
+          </w:p>
+        </w:tc>
+        <w:tc>
+          <w:tcPr>
+            <w:tcW w:type="dxa" w:w="6438"/>
+            <w:tcBorders>
+              <w:top w:val="single" w:color="D0D5DD" w:sz="4"/>
+              <w:left w:val="single" w:color="D0D5DD" w:sz="4"/>
+              <w:bottom w:val="single" w:color="D0D5DD" w:sz="4"/>
+              <w:right w:val="single" w:color="D0D5DD" w:sz="4"/>
+            </w:tcBorders>
+            <w:shd w:fill="FFFFFF" w:val="clear"/>
+            <w:tcMar>
+              <w:top w:type="dxa" w:w="70"/>
+              <w:left w:type="dxa" w:w="100"/>
+              <w:bottom w:type="dxa" w:w="70"/>
+              <w:right w:type="dxa" w:w="100"/>
+            </w:tcMar>
+          </w:tcPr>
+          <w:p>
+            <w:pPr>
+              <w:spacing w:line="260"/>
+            </w:pPr>
+            <w:r>
+              <w:rPr>
+                <w:rFonts w:ascii="Arial" w:cs="Arial" w:eastAsia="Arial" w:hAnsi="Arial"/>
+                <w:sz w:val="18"/>
+                <w:szCs w:val="18"/>
+              </w:rPr>
+              <w:t xml:space="preserve">Description, Confidence Level, Validation Action, Validation Due Date, Status (Unconfirmed / Confirmed Correct / Confirmed Incorrect)</w:t>
+            </w:r>
+          </w:p>
+        </w:tc>
+      </w:tr>
+      <w:tr>
+        <w:trPr>
+          <w:cantSplit/>
+        </w:trPr>
+        <w:tc>
+          <w:tcPr>
+            <w:tcW w:type="dxa" w:w="1800"/>
+            <w:tcBorders>
+              <w:top w:val="single" w:color="D0D5DD" w:sz="4"/>
+              <w:left w:val="single" w:color="D0D5DD" w:sz="4"/>
+              <w:bottom w:val="single" w:color="D0D5DD" w:sz="4"/>
+              <w:right w:val="single" w:color="D0D5DD" w:sz="4"/>
+            </w:tcBorders>
+            <w:shd w:fill="F8FAFC" w:val="clear"/>
+            <w:tcMar>
+              <w:top w:type="dxa" w:w="70"/>
+              <w:left w:type="dxa" w:w="100"/>
+              <w:bottom w:type="dxa" w:w="70"/>
+              <w:right w:type="dxa" w:w="100"/>
+            </w:tcMar>
+          </w:tcPr>
+          <w:p>
+            <w:pPr>
+              <w:spacing w:line="260"/>
+            </w:pPr>
+            <w:r>
+              <w:rPr>
+                <w:rFonts w:ascii="Arial" w:cs="Arial" w:eastAsia="Arial" w:hAnsi="Arial"/>
+                <w:sz w:val="18"/>
+                <w:szCs w:val="18"/>
+              </w:rPr>
+              <w:t xml:space="preserve">Dependencies</w:t>
+            </w:r>
+          </w:p>
+        </w:tc>
+        <w:tc>
+          <w:tcPr>
+            <w:tcW w:type="dxa" w:w="1400"/>
+            <w:tcBorders>
+              <w:top w:val="single" w:color="D0D5DD" w:sz="4"/>
+              <w:left w:val="single" w:color="D0D5DD" w:sz="4"/>
+              <w:bottom w:val="single" w:color="D0D5DD" w:sz="4"/>
+              <w:right w:val="single" w:color="D0D5DD" w:sz="4"/>
+            </w:tcBorders>
+            <w:shd w:fill="F8FAFC" w:val="clear"/>
+            <w:tcMar>
+              <w:top w:type="dxa" w:w="70"/>
+              <w:left w:type="dxa" w:w="100"/>
+              <w:bottom w:type="dxa" w:w="70"/>
+              <w:right w:type="dxa" w:w="100"/>
+            </w:tcMar>
+          </w:tcPr>
+          <w:p>
+            <w:pPr>
+              <w:spacing w:line="260"/>
+            </w:pPr>
+            <w:r>
+              <w:rPr>
+                <w:rFonts w:ascii="Arial" w:cs="Arial" w:eastAsia="Arial" w:hAnsi="Arial"/>
+                <w:sz w:val="18"/>
+                <w:szCs w:val="18"/>
+              </w:rPr>
+              <w:t xml:space="preserve">dependency</w:t>
+            </w:r>
+          </w:p>
+        </w:tc>
+        <w:tc>
+          <w:tcPr>
+            <w:tcW w:type="dxa" w:w="6438"/>
+            <w:tcBorders>
+              <w:top w:val="single" w:color="D0D5DD" w:sz="4"/>
+              <w:left w:val="single" w:color="D0D5DD" w:sz="4"/>
+              <w:bottom w:val="single" w:color="D0D5DD" w:sz="4"/>
+              <w:right w:val="single" w:color="D0D5DD" w:sz="4"/>
+            </w:tcBorders>
+            <w:shd w:fill="F8FAFC" w:val="clear"/>
+            <w:tcMar>
+              <w:top w:type="dxa" w:w="70"/>
+              <w:left w:type="dxa" w:w="100"/>
+              <w:bottom w:type="dxa" w:w="70"/>
+              <w:right w:type="dxa" w:w="100"/>
+            </w:tcMar>
+          </w:tcPr>
+          <w:p>
+            <w:pPr>
+              <w:spacing w:line="260"/>
+            </w:pPr>
+            <w:r>
+              <w:rPr>
+                <w:rFonts w:ascii="Arial" w:cs="Arial" w:eastAsia="Arial" w:hAnsi="Arial"/>
+                <w:sz w:val="18"/>
+                <w:szCs w:val="18"/>
+              </w:rPr>
+              <w:t xml:space="preserve">Description, Dependency For / From, Type, Date Required, Priority, Status (Open / Closed)</w:t>
+            </w:r>
+          </w:p>
+        </w:tc>
+      </w:tr>
+      <w:tr>
+        <w:trPr>
+          <w:cantSplit/>
+        </w:trPr>
+        <w:tc>
+          <w:tcPr>
+            <w:tcW w:type="dxa" w:w="1800"/>
+            <w:tcBorders>
+              <w:top w:val="single" w:color="D0D5DD" w:sz="4"/>
+              <w:left w:val="single" w:color="D0D5DD" w:sz="4"/>
+              <w:bottom w:val="single" w:color="D0D5DD" w:sz="4"/>
+              <w:right w:val="single" w:color="D0D5DD" w:sz="4"/>
+            </w:tcBorders>
+            <w:shd w:fill="FFFFFF" w:val="clear"/>
+            <w:tcMar>
+              <w:top w:type="dxa" w:w="70"/>
+              <w:left w:type="dxa" w:w="100"/>
+              <w:bottom w:type="dxa" w:w="70"/>
+              <w:right w:type="dxa" w:w="100"/>
+            </w:tcMar>
+          </w:tcPr>
+          <w:p>
+            <w:pPr>
+              <w:spacing w:line="260"/>
+            </w:pPr>
+            <w:r>
+              <w:rPr>
+                <w:rFonts w:ascii="Arial" w:cs="Arial" w:eastAsia="Arial" w:hAnsi="Arial"/>
+                <w:b/>
+                <w:bCs/>
+                <w:sz w:val="18"/>
+                <w:szCs w:val="18"/>
+              </w:rPr>
+              <w:t xml:space="preserve">Decisions</w:t>
+            </w:r>
+          </w:p>
+        </w:tc>
+        <w:tc>
+          <w:tcPr>
+            <w:tcW w:type="dxa" w:w="1400"/>
+            <w:tcBorders>
+              <w:top w:val="single" w:color="D0D5DD" w:sz="4"/>
+              <w:left w:val="single" w:color="D0D5DD" w:sz="4"/>
+              <w:bottom w:val="single" w:color="D0D5DD" w:sz="4"/>
+              <w:right w:val="single" w:color="D0D5DD" w:sz="4"/>
+            </w:tcBorders>
+            <w:shd w:fill="FFFFFF" w:val="clear"/>
+            <w:tcMar>
+              <w:top w:type="dxa" w:w="70"/>
+              <w:left w:type="dxa" w:w="100"/>
+              <w:bottom w:type="dxa" w:w="70"/>
+              <w:right w:type="dxa" w:w="100"/>
+            </w:tcMar>
+          </w:tcPr>
+          <w:p>
+            <w:pPr>
+              <w:spacing w:line="260"/>
+            </w:pPr>
+            <w:r>
+              <w:rPr>
+                <w:rFonts w:ascii="Arial" w:cs="Arial" w:eastAsia="Arial" w:hAnsi="Arial"/>
+                <w:sz w:val="18"/>
+                <w:szCs w:val="18"/>
+              </w:rPr>
+              <w:t xml:space="preserve">decision</w:t>
+            </w:r>
+          </w:p>
+        </w:tc>
+        <w:tc>
+          <w:tcPr>
+            <w:tcW w:type="dxa" w:w="6438"/>
+            <w:tcBorders>
+              <w:top w:val="single" w:color="D0D5DD" w:sz="4"/>
+              <w:left w:val="single" w:color="D0D5DD" w:sz="4"/>
+              <w:bottom w:val="single" w:color="D0D5DD" w:sz="4"/>
+              <w:right w:val="single" w:color="D0D5DD" w:sz="4"/>
+            </w:tcBorders>
+            <w:shd w:fill="FFFFFF" w:val="clear"/>
+            <w:tcMar>
+              <w:top w:type="dxa" w:w="70"/>
+              <w:left w:type="dxa" w:w="100"/>
+              <w:bottom w:type="dxa" w:w="70"/>
+              <w:right w:type="dxa" w:w="100"/>
+            </w:tcMar>
+          </w:tcPr>
+          <w:p>
+            <w:pPr>
+              <w:spacing w:line="260"/>
+            </w:pPr>
+            <w:r>
+              <w:rPr>
+                <w:rFonts w:ascii="Arial" w:cs="Arial" w:eastAsia="Arial" w:hAnsi="Arial"/>
+                <w:sz w:val="18"/>
+                <w:szCs w:val="18"/>
+              </w:rPr>
+              <w:t xml:space="preserve">Summary Title, Decision / Description, Category, Decision Maker / Forum, </w:t>
+            </w:r>
+            <w:r>
+              <w:rPr>
+                <w:rFonts w:ascii="Arial" w:cs="Arial" w:eastAsia="Arial" w:hAnsi="Arial"/>
+                <w:b/>
+                <w:bCs/>
+                <w:sz w:val="18"/>
+                <w:szCs w:val="18"/>
+              </w:rPr>
+              <w:t xml:space="preserve">Date Decided</w:t>
+            </w:r>
+            <w:r>
+              <w:rPr>
+                <w:rFonts w:ascii="Arial" w:cs="Arial" w:eastAsia="Arial" w:hAnsi="Arial"/>
+                <w:sz w:val="18"/>
+                <w:szCs w:val="18"/>
+              </w:rPr>
+              <w:t xml:space="preserve">, Rationale, Impact of Decision, </w:t>
+            </w:r>
+            <w:r>
+              <w:rPr>
+                <w:rFonts w:ascii="Arial" w:cs="Arial" w:eastAsia="Arial" w:hAnsi="Arial"/>
+                <w:b/>
+                <w:bCs/>
+                <w:sz w:val="18"/>
+                <w:szCs w:val="18"/>
+              </w:rPr>
+              <w:t xml:space="preserve">Status (Pending / Approved / Rejected / Superseded)</w:t>
+            </w:r>
+            <w:r>
+              <w:rPr>
+                <w:rFonts w:ascii="Arial" w:cs="Arial" w:eastAsia="Arial" w:hAnsi="Arial"/>
+                <w:sz w:val="18"/>
+                <w:szCs w:val="18"/>
+              </w:rPr>
+              <w:t xml:space="preserve">, Owner, Review Date, Linked Risk / Issue ID</w:t>
+            </w:r>
+          </w:p>
+        </w:tc>
+      </w:tr>
+    </w:tbl>
+    <w:p>
+      <w:pPr>
+        <w:spacing w:after="140"/>
+      </w:pPr>
+    </w:p>
+    <w:p>
+      <w:pPr>
+        <w:spacing w:after="120" w:line="300"/>
+      </w:pPr>
+      <w:r>
+        <w:rPr>
+          <w:rFonts w:ascii="Arial" w:cs="Arial" w:eastAsia="Arial" w:hAnsi="Arial"/>
+          <w:sz w:val="21"/>
+          <w:szCs w:val="21"/>
+        </w:rPr>
+        <w:t xml:space="preserve">The dashboard shows open items by rating, a likelihood × impact heat-map, the dependencies due in the next 30 days and the </w:t>
       </w:r>
       <w:r>
         <w:rPr>
@@ -10662,15 +11518,51 @@
           <w:sz w:val="21"/>
           <w:szCs w:val="21"/>
         </w:rPr>
-        <w:t xml:space="preserve">Risks, Issues, Assumptions and Dependencies</w:t>
-      </w:r>
-      <w:r>
-        <w:rPr>
-          <w:rFonts w:ascii="Arial" w:cs="Arial" w:eastAsia="Arial" w:hAnsi="Arial"/>
-          <w:sz w:val="21"/>
-          <w:szCs w:val="21"/>
-        </w:rPr>
-        <w:t xml:space="preserve"> sheets by their header names and shows open items by rating (Very Low / Low / Medium / High / Very High), a likelihood × impact heat-map and the items needing attention. </w:t>
+        <w:t xml:space="preserve">Decisions</w:t>
+      </w:r>
+      <w:r>
+        <w:rPr>
+          <w:rFonts w:ascii="Arial" w:cs="Arial" w:eastAsia="Arial" w:hAnsi="Arial"/>
+          <w:sz w:val="21"/>
+          <w:szCs w:val="21"/>
+        </w:rPr>
+        <w:t xml:space="preserve"> table (pending first, then the most recent). Decisions marked </w:t>
+      </w:r>
+      <w:r>
+        <w:rPr>
+          <w:rFonts w:ascii="Arial" w:cs="Arial" w:eastAsia="Arial" w:hAnsi="Arial"/>
+          <w:i/>
+          <w:iCs/>
+          <w:sz w:val="21"/>
+          <w:szCs w:val="21"/>
+        </w:rPr>
+        <w:t xml:space="preserve">Pending</w:t>
+      </w:r>
+      <w:r>
+        <w:rPr>
+          <w:rFonts w:ascii="Arial" w:cs="Arial" w:eastAsia="Arial" w:hAnsi="Arial"/>
+          <w:sz w:val="21"/>
+          <w:szCs w:val="21"/>
+        </w:rPr>
+        <w:t xml:space="preserve"> count as open and appear under "Actions Underway"; decisions whose </w:t>
+      </w:r>
+      <w:r>
+        <w:rPr>
+          <w:rFonts w:ascii="Arial" w:cs="Arial" w:eastAsia="Arial" w:hAnsi="Arial"/>
+          <w:i/>
+          <w:iCs/>
+          <w:sz w:val="21"/>
+          <w:szCs w:val="21"/>
+        </w:rPr>
+        <w:t xml:space="preserve">Date Decided</w:t>
+      </w:r>
+      <w:r>
+        <w:rPr>
+          <w:rFonts w:ascii="Arial" w:cs="Arial" w:eastAsia="Arial" w:hAnsi="Arial"/>
+          <w:sz w:val="21"/>
+          <w:szCs w:val="21"/>
+        </w:rPr>
+        <w:t xml:space="preserve"> falls in the month or week are counted in the highlights. An old RAID file without a Decisions sheet is fine — that part simply shows "No decisions logged". </w:t>
       </w:r>
       <w:r>
         <w:rPr>
@@ -10688,7 +11580,25 @@
           <w:sz w:val="21"/>
           <w:szCs w:val="21"/>
         </w:rPr>
-        <w:t xml:space="preserve"> is Red when a Very High item is open and Amber when a High item is open. A closed risk or a resolved issue drops out automatically.</w:t>
+        <w:t xml:space="preserve"> is Red when a Very High item is open and Amber when a High item is open. A closed risk or a resolved issue drops out automatically; set </w:t>
+      </w:r>
+      <w:r>
+        <w:rPr>
+          <w:rFonts w:ascii="Arial" w:cs="Arial" w:eastAsia="Arial" w:hAnsi="Arial"/>
+          <w:i/>
+          <w:iCs/>
+          <w:sz w:val="21"/>
+          <w:szCs w:val="21"/>
+        </w:rPr>
+        <w:t xml:space="preserve">Archived = Yes</w:t>
+      </w:r>
+      <w:r>
+        <w:rPr>
+          <w:rFonts w:ascii="Arial" w:cs="Arial" w:eastAsia="Arial" w:hAnsi="Arial"/>
+          <w:sz w:val="21"/>
+          <w:szCs w:val="21"/>
+        </w:rPr>
+        <w:t xml:space="preserve"> to hide any row.</w:t>
       </w:r>
     </w:p>
     <w:p>
@@ -10920,7 +11830,7 @@
           <w:sz w:val="21"/>
           <w:szCs w:val="21"/>
         </w:rPr>
-        <w:t xml:space="preserve">, or </w:t>
+        <w:t xml:space="preserve"> for slides (built on the client PowerPoint theme; charts and tables stay editable), </w:t>
       </w:r>
       <w:r>
         <w:rPr>
@@ -10930,6 +11840,24 @@
           <w:sz w:val="21"/>
           <w:szCs w:val="21"/>
         </w:rPr>
+        <w:t xml:space="preserve">Export PDF</w:t>
+      </w:r>
+      <w:r>
+        <w:rPr>
+          <w:rFonts w:ascii="Arial" w:cs="Arial" w:eastAsia="Arial" w:hAnsi="Arial"/>
+          <w:sz w:val="21"/>
+          <w:szCs w:val="21"/>
+        </w:rPr>
+        <w:t xml:space="preserve"> for a document you can read or print (the Monthly Council and Weekly Report export every page of the pack), or </w:t>
+      </w:r>
+      <w:r>
+        <w:rPr>
+          <w:rFonts w:ascii="Arial" w:cs="Arial" w:eastAsia="Arial" w:hAnsi="Arial"/>
+          <w:b/>
+          <w:bCs/>
+          <w:sz w:val="21"/>
+          <w:szCs w:val="21"/>
+        </w:rPr>
         <w:t xml:space="preserve">Copy as picture</w:t>
       </w:r>
       <w:r>
@@ -10938,7 +11866,7 @@
           <w:sz w:val="21"/>
           <w:szCs w:val="21"/>
         </w:rPr>
-        <w:t xml:space="preserve"> on any page, for your slides.</w:t>
+        <w:t xml:space="preserve"> on any single page.</w:t>
       </w:r>
     </w:p>
     <w:p>

</xml_diff>

<commit_message>
RAID section: separate page per RAID sheet (Risks, Issues, Assumptions, Dependencies, Decisions) with own matrix/heat-map and open items; PowerPoint slide per sheet
Co-Authored-By: Claude Sonnet 5.5 <noreply@anthropic.com>
</commit_message>
<xml_diff>
--- a/docs/ATS_Data_Filling_Guide.docx
+++ b/docs/ATS_Data_Filling_Guide.docx
@@ -11508,7 +11508,7 @@
           <w:sz w:val="21"/>
           <w:szCs w:val="21"/>
         </w:rPr>
-        <w:t xml:space="preserve">The dashboard shows open items by rating, a likelihood × impact heat-map, the dependencies due in the next 30 days and the </w:t>
+        <w:t xml:space="preserve">The dashboard gives each sheet its own page under </w:t>
       </w:r>
       <w:r>
         <w:rPr>
@@ -11518,15 +11518,15 @@
           <w:sz w:val="21"/>
           <w:szCs w:val="21"/>
         </w:rPr>
-        <w:t xml:space="preserve">Decisions</w:t>
-      </w:r>
-      <w:r>
-        <w:rPr>
-          <w:rFonts w:ascii="Arial" w:cs="Arial" w:eastAsia="Arial" w:hAnsi="Arial"/>
-          <w:sz w:val="21"/>
-          <w:szCs w:val="21"/>
-        </w:rPr>
-        <w:t xml:space="preserve"> table (pending first, then the most recent). Decisions marked </w:t>
+        <w:t xml:space="preserve">Risks, Issues &amp; Lessons</w:t>
+      </w:r>
+      <w:r>
+        <w:rPr>
+          <w:rFonts w:ascii="Arial" w:cs="Arial" w:eastAsia="Arial" w:hAnsi="Arial"/>
+          <w:sz w:val="21"/>
+          <w:szCs w:val="21"/>
+        </w:rPr>
+        <w:t xml:space="preserve"> (RAID Overview, Risks, Issues, Assumptions, Dependencies, Decisions, Lessons Learned). Every page has its own counts, a clickable matrix (risk likelihood × impact, issue priority × severity, assumption confidence × status, dependency priority × when needed, decision category × status), charts, auto-drafted highlights and the full list of open items with closed ones tucked away. Decisions marked </w:t>
       </w:r>
       <w:r>
         <w:rPr>

</xml_diff>